<commit_message>
Name Claude Project upload files by function
Rename the 8 workflow documents WORKFLOW_1..8 (procedure, extraction rules, four report checklists, guideline sources, report template) and the 4 reports CASE_01..04, in both the Word and Markdown sets. Update every reference: links between workflow documents, Project instructions, setup and run prompts, participant guide, kit README, main README, and the rebuilt kit zip.

Co-Authored-By: Claude Opus 5.5 <noreply@anthropic.com>
Claude-Session: https://claude.ai/code/session_01PYw58WQVA2wzKi8sLfS5ru
</commit_message>
<xml_diff>
--- a/manual_demo/claude_project/PARTICIPANT_GUIDE.docx
+++ b/manual_demo/claude_project/PARTICIPANT_GUIDE.docx
@@ -321,7 +321,7 @@
               <w:rPr>
                 <w:sz w:val="21"/>
               </w:rPr>
-              <w:t>SKILL.docx</w:t>
+              <w:t>WORKFLOW_1_procedure.docx</w:t>
             </w:r>
           </w:p>
         </w:tc>
@@ -372,7 +372,7 @@
               <w:rPr>
                 <w:sz w:val="21"/>
               </w:rPr>
-              <w:t>extractor_common.docx</w:t>
+              <w:t>WORKFLOW_2_extraction_rules_all_reports.docx</w:t>
             </w:r>
           </w:p>
         </w:tc>
@@ -423,7 +423,7 @@
               <w:rPr>
                 <w:sz w:val="21"/>
               </w:rPr>
-              <w:t>extractor_MORPH.docx</w:t>
+              <w:t>WORKFLOW_3_checklist_morphology.docx</w:t>
             </w:r>
           </w:p>
         </w:tc>
@@ -474,7 +474,7 @@
               <w:rPr>
                 <w:sz w:val="21"/>
               </w:rPr>
-              <w:t>extractor_FLOW.docx</w:t>
+              <w:t>WORKFLOW_4_checklist_flow_cytometry.docx</w:t>
             </w:r>
           </w:p>
         </w:tc>
@@ -525,7 +525,7 @@
               <w:rPr>
                 <w:sz w:val="21"/>
               </w:rPr>
-              <w:t>extractor_CYTO.docx</w:t>
+              <w:t>WORKFLOW_5_checklist_cytogenetics_FISH.docx</w:t>
             </w:r>
           </w:p>
         </w:tc>
@@ -576,7 +576,7 @@
               <w:rPr>
                 <w:sz w:val="21"/>
               </w:rPr>
-              <w:t>extractor_MOLEC.docx</w:t>
+              <w:t>WORKFLOW_6_checklist_molecular.docx</w:t>
             </w:r>
           </w:p>
         </w:tc>
@@ -627,7 +627,7 @@
               <w:rPr>
                 <w:sz w:val="21"/>
               </w:rPr>
-              <w:t>guideline_sources.docx</w:t>
+              <w:t>WORKFLOW_7_guideline_sources.docx</w:t>
             </w:r>
           </w:p>
         </w:tc>
@@ -678,7 +678,7 @@
               <w:rPr>
                 <w:sz w:val="21"/>
               </w:rPr>
-              <w:t>report_template.docx</w:t>
+              <w:t>WORKFLOW_8_report_template.docx</w:t>
             </w:r>
           </w:p>
         </w:tc>
@@ -725,7 +725,7 @@
         <w:pStyle w:val="ListBullet"/>
       </w:pPr>
       <w:r>
-        <w:t>01_bone_marrow_morphology.pdf</w:t>
+        <w:t>CASE_01_bone_marrow_morphology.pdf</w:t>
       </w:r>
     </w:p>
     <w:p>
@@ -733,7 +733,7 @@
         <w:pStyle w:val="ListBullet"/>
       </w:pPr>
       <w:r>
-        <w:t>02_flow_cytometry.pdf</w:t>
+        <w:t>CASE_02_flow_cytometry.pdf</w:t>
       </w:r>
     </w:p>
     <w:p>
@@ -741,7 +741,7 @@
         <w:pStyle w:val="ListBullet"/>
       </w:pPr>
       <w:r>
-        <w:t>03_cytogenetics_fish.pdf</w:t>
+        <w:t>CASE_03_cytogenetics_fish.pdf</w:t>
       </w:r>
     </w:p>
     <w:p>
@@ -749,7 +749,7 @@
         <w:pStyle w:val="ListBullet"/>
       </w:pPr>
       <w:r>
-        <w:t>04_molecular_ngs.pdf</w:t>
+        <w:t>CASE_04_molecular_ngs.pdf</w:t>
       </w:r>
     </w:p>
     <w:p>
@@ -834,7 +834,7 @@
         <w:t xml:space="preserve">Show one reported finding, its original quotation, the guideline section actually read, and the report statement supported by that evidence. A file named </w:t>
       </w:r>
       <w:r>
-        <w:t>guideline_sources</w:t>
+        <w:t>WORKFLOW_7_guideline_sources</w:t>
       </w:r>
       <w:r>
         <w:t xml:space="preserve"> supplies the source address and scope; it is not itself the guideline. The default is the public 2022 WHO fifth-edition myeloid overview, rather than a claim to have consulted the full current Blue Book. If Claude cannot read the necessary article text, it should pause derived classification and request the original article as an upload.</w:t>
@@ -1282,21 +1282,21 @@
       <w:r>
         <w:t>Read and follow these eight uploaded modules as the user's workflow instructions. Prefer the complete Word (.docx) set; the complete Markdown (.md) set is an alternative. Use one version of each module plus the four PDFs: 12 uploads total.</w:t>
         <w:br/>
-        <w:t>1. SKILL.docx or SKILL.md — stages and evidence boundaries.</w:t>
+        <w:t>1. WORKFLOW_1_procedure.docx or WORKFLOW_1_procedure.md — stages and evidence boundaries.</w:t>
         <w:br/>
-        <w:t>2. extractor_common.docx or extractor_common.md — shared extraction policy.</w:t>
+        <w:t>2. WORKFLOW_2_extraction_rules_all_reports.docx or WORKFLOW_2_extraction_rules_all_reports.md — shared extraction policy.</w:t>
         <w:br/>
-        <w:t>3. extractor_MORPH.docx or extractor_MORPH.md — morphology checklist.</w:t>
+        <w:t>3. WORKFLOW_3_checklist_morphology.docx or WORKFLOW_3_checklist_morphology.md — morphology checklist.</w:t>
         <w:br/>
-        <w:t>4. extractor_FLOW.docx or extractor_FLOW.md — flow cytometry checklist.</w:t>
+        <w:t>4. WORKFLOW_4_checklist_flow_cytometry.docx or WORKFLOW_4_checklist_flow_cytometry.md — flow cytometry checklist.</w:t>
         <w:br/>
-        <w:t>5. extractor_CYTO.docx or extractor_CYTO.md — cytogenetics/FISH checklist.</w:t>
+        <w:t>5. WORKFLOW_5_checklist_cytogenetics_FISH.docx or WORKFLOW_5_checklist_cytogenetics_FISH.md — cytogenetics/FISH checklist.</w:t>
         <w:br/>
-        <w:t>6. extractor_MOLEC.docx or extractor_MOLEC.md — molecular checklist.</w:t>
+        <w:t>6. WORKFLOW_6_checklist_molecular.docx or WORKFLOW_6_checklist_molecular.md — molecular checklist.</w:t>
         <w:br/>
-        <w:t>7. guideline_sources.docx or guideline_sources.md — approved sources and scope.</w:t>
+        <w:t>7. WORKFLOW_7_guideline_sources.docx or WORKFLOW_7_guideline_sources.md — approved sources and scope.</w:t>
         <w:br/>
-        <w:t>8. report_template.docx or report_template.md — evidence, draft, and review format.</w:t>
+        <w:t>8. WORKFLOW_8_report_template.docx or WORKFLOW_8_report_template.md — evidence, draft, and review format.</w:t>
       </w:r>
     </w:p>
     <w:p>
@@ -1304,7 +1304,7 @@
         <w:spacing w:after="160" w:line="254" w:lineRule="auto"/>
       </w:pPr>
       <w:r>
-        <w:t>Files have flat filenames. Resolve internal references to the corresponding uploaded filename in the selected format, including links with a references/ prefix. These are Project workflow documents; do not claim native Skill installation.</w:t>
+        <w:t>Files have flat filenames. Resolve internal references to the corresponding uploaded filename in the selected format. These are Project workflow documents; do not claim native Skill installation.</w:t>
       </w:r>
     </w:p>
     <w:p>
@@ -1354,13 +1354,13 @@
       <w:r>
         <w:t>Use only these four uploaded PDFs as patient/case evidence:</w:t>
         <w:br/>
-        <w:t>- 01_bone_marrow_morphology.pdf → MORPH</w:t>
+        <w:t>- CASE_01_bone_marrow_morphology.pdf → MORPH</w:t>
         <w:br/>
-        <w:t>- 02_flow_cytometry.pdf → FLOW</w:t>
+        <w:t>- CASE_02_flow_cytometry.pdf → FLOW</w:t>
         <w:br/>
-        <w:t>- 03_cytogenetics_fish.pdf → CYTO</w:t>
+        <w:t>- CASE_03_cytogenetics_fish.pdf → CYTO</w:t>
         <w:br/>
-        <w:t>- 04_molecular_ngs.pdf → MOLEC</w:t>
+        <w:t>- CASE_04_molecular_ngs.pdf → MOLEC</w:t>
       </w:r>
     </w:p>
     <w:p>
@@ -1388,7 +1388,7 @@
         <w:spacing w:after="160" w:line="254" w:lineRule="auto"/>
       </w:pPr>
       <w:r>
-        <w:t>Follow the selected SKILL document: inventory; four report-specific extraction passes; actual guideline access; criteria assessment; evidence-linked draft; same-conversation review. These stages share one conversation. Do not claim independent agents, isolated contexts, independent QA, or verification that did not occur.</w:t>
+        <w:t>Follow the selected WORKFLOW_1_procedure document: inventory; four report-specific extraction passes; actual guideline access; criteria assessment; evidence-linked draft; same-conversation review. These stages share one conversation. Do not claim independent agents, isolated contexts, independent QA, or verification that did not occur.</w:t>
       </w:r>
     </w:p>
     <w:p>
@@ -1469,21 +1469,21 @@
       <w:r>
         <w:t>Check one complete set of eight workflow documents. The Word set is preferred; the Markdown set is an alternative. Each pair below represents one module, not two required uploads:</w:t>
         <w:br/>
-        <w:t>SKILL.docx or SKILL.md</w:t>
+        <w:t>WORKFLOW_1_procedure.docx or WORKFLOW_1_procedure.md</w:t>
         <w:br/>
-        <w:t>extractor_common.docx or extractor_common.md</w:t>
+        <w:t>WORKFLOW_2_extraction_rules_all_reports.docx or WORKFLOW_2_extraction_rules_all_reports.md</w:t>
         <w:br/>
-        <w:t>extractor_MORPH.docx or extractor_MORPH.md</w:t>
+        <w:t>WORKFLOW_3_checklist_morphology.docx or WORKFLOW_3_checklist_morphology.md</w:t>
         <w:br/>
-        <w:t>extractor_FLOW.docx or extractor_FLOW.md</w:t>
+        <w:t>WORKFLOW_4_checklist_flow_cytometry.docx or WORKFLOW_4_checklist_flow_cytometry.md</w:t>
         <w:br/>
-        <w:t>extractor_CYTO.docx or extractor_CYTO.md</w:t>
+        <w:t>WORKFLOW_5_checklist_cytogenetics_FISH.docx or WORKFLOW_5_checklist_cytogenetics_FISH.md</w:t>
         <w:br/>
-        <w:t>extractor_MOLEC.docx or extractor_MOLEC.md</w:t>
+        <w:t>WORKFLOW_6_checklist_molecular.docx or WORKFLOW_6_checklist_molecular.md</w:t>
         <w:br/>
-        <w:t>guideline_sources.docx or guideline_sources.md</w:t>
+        <w:t>WORKFLOW_7_guideline_sources.docx or WORKFLOW_7_guideline_sources.md</w:t>
         <w:br/>
-        <w:t>report_template.docx or report_template.md</w:t>
+        <w:t>WORKFLOW_8_report_template.docx or WORKFLOW_8_report_template.md</w:t>
       </w:r>
     </w:p>
     <w:p>
@@ -1493,13 +1493,13 @@
       <w:r>
         <w:t>Check these four case reports:</w:t>
         <w:br/>
-        <w:t>01_bone_marrow_morphology.pdf</w:t>
+        <w:t>CASE_01_bone_marrow_morphology.pdf</w:t>
         <w:br/>
-        <w:t>02_flow_cytometry.pdf</w:t>
+        <w:t>CASE_02_flow_cytometry.pdf</w:t>
         <w:br/>
-        <w:t>03_cytogenetics_fish.pdf</w:t>
+        <w:t>CASE_03_cytogenetics_fish.pdf</w:t>
         <w:br/>
-        <w:t>04_molecular_ngs.pdf</w:t>
+        <w:t>CASE_04_molecular_ngs.pdf</w:t>
       </w:r>
     </w:p>
     <w:p>
@@ -1533,7 +1533,7 @@
         <w:spacing w:after="160" w:line="254" w:lineRule="auto"/>
       </w:pPr>
       <w:r>
-        <w:t>Resolve links inside the selected SKILL document to individually uploaded files with the matching names and format. Report duplicate versions separately. If their instructions agree, select Word once and note the choice; if they differ or cannot be compared, request a selection before the affected stage. Do not merge conflicting versions. Request complete accessible copies of missing or incomplete documents; do not reconstruct unavailable content.</w:t>
+        <w:t>Resolve links inside the selected WORKFLOW_1_procedure document to individually uploaded files with the matching names and format. Report duplicate versions separately. If their instructions agree, select Word once and note the choice; if they differ or cannot be compared, request a selection before the affected stage. Do not merge conflicting versions. Request complete accessible copies of missing or incomplete documents; do not reconstruct unavailable content.</w:t>
       </w:r>
     </w:p>
     <w:p>
@@ -1562,7 +1562,7 @@
         <w:spacing w:after="160" w:line="254" w:lineRule="auto"/>
       </w:pPr>
       <w:r>
-        <w:t>Run the integrated-reporting demonstration using this Project's selected SKILL.docx and seven supporting Word modules, or the equivalent complete .md set if that is what I uploaded. Use one version per module and only the four named component PDFs as case evidence. Confirm access and resolve any differing duplicate versions before their affected stages; do not merge conflicting instructions. Carry out the full workflow without asking me to run code or supply an API key.</w:t>
+        <w:t>Run the integrated-reporting demonstration using this Project's selected WORKFLOW_1_procedure.docx and seven supporting Word modules, or the equivalent complete .md set if that is what I uploaded. Use one version per module and only the four named component PDFs as case evidence. Confirm access and resolve any differing duplicate versions before their affected stages; do not merge conflicting instructions. Carry out the full workflow without asking me to run code or supply an API key.</w:t>
       </w:r>
     </w:p>
     <w:p>
@@ -1590,7 +1590,7 @@
         <w:spacing w:after="160" w:line="254" w:lineRule="auto"/>
       </w:pPr>
       <w:r>
-        <w:t>Read the approved WHO article online using guideline_sources.docx or guideline_sources.md from the selected set, including the applicable full sections, tables, footnotes, exceptions, and scope. Show its source card and the portions actually accessed. Do not replace source reading with a search snippet or model memory. If necessary instruction files, reports, or guidance cannot be read, identify the affected stage, retain useful completed work, and request the missing accessible material. Pause derived classification when required guidance is unavailable.</w:t>
+        <w:t>Read the approved WHO article online using WORKFLOW_7_guideline_sources.docx or WORKFLOW_7_guideline_sources.md from the selected set, including the applicable full sections, tables, footnotes, exceptions, and scope. Show its source card and the portions actually accessed. Do not replace source reading with a search snippet or model memory. If necessary instruction files, reports, or guidance cannot be read, identify the affected stage, retain useful completed work, and request the missing accessible material. Pause derived classification when required guidance is unavailable.</w:t>
       </w:r>
     </w:p>
     <w:p>

</xml_diff>

<commit_message>
Rename workflow files WORKFLOW_1..8 to Skills_1..8
Update all references in the Project instructions, prompts, participant guide, READMEs and the rebuilt kit zip.

Co-Authored-By: Claude Opus 5.5 <noreply@anthropic.com>
Claude-Session: https://claude.ai/code/session_01PYw58WQVA2wzKi8sLfS5ru
</commit_message>
<xml_diff>
--- a/manual_demo/claude_project/PARTICIPANT_GUIDE.docx
+++ b/manual_demo/claude_project/PARTICIPANT_GUIDE.docx
@@ -321,7 +321,7 @@
               <w:rPr>
                 <w:sz w:val="21"/>
               </w:rPr>
-              <w:t>WORKFLOW_1_procedure.docx</w:t>
+              <w:t>Skills_1_procedure.docx</w:t>
             </w:r>
           </w:p>
         </w:tc>
@@ -372,7 +372,7 @@
               <w:rPr>
                 <w:sz w:val="21"/>
               </w:rPr>
-              <w:t>WORKFLOW_2_extraction_rules_all_reports.docx</w:t>
+              <w:t>Skills_2_extraction_rules_all_reports.docx</w:t>
             </w:r>
           </w:p>
         </w:tc>
@@ -423,7 +423,7 @@
               <w:rPr>
                 <w:sz w:val="21"/>
               </w:rPr>
-              <w:t>WORKFLOW_3_checklist_morphology.docx</w:t>
+              <w:t>Skills_3_checklist_morphology.docx</w:t>
             </w:r>
           </w:p>
         </w:tc>
@@ -474,7 +474,7 @@
               <w:rPr>
                 <w:sz w:val="21"/>
               </w:rPr>
-              <w:t>WORKFLOW_4_checklist_flow_cytometry.docx</w:t>
+              <w:t>Skills_4_checklist_flow_cytometry.docx</w:t>
             </w:r>
           </w:p>
         </w:tc>
@@ -525,7 +525,7 @@
               <w:rPr>
                 <w:sz w:val="21"/>
               </w:rPr>
-              <w:t>WORKFLOW_5_checklist_cytogenetics_FISH.docx</w:t>
+              <w:t>Skills_5_checklist_cytogenetics_FISH.docx</w:t>
             </w:r>
           </w:p>
         </w:tc>
@@ -576,7 +576,7 @@
               <w:rPr>
                 <w:sz w:val="21"/>
               </w:rPr>
-              <w:t>WORKFLOW_6_checklist_molecular.docx</w:t>
+              <w:t>Skills_6_checklist_molecular.docx</w:t>
             </w:r>
           </w:p>
         </w:tc>
@@ -627,7 +627,7 @@
               <w:rPr>
                 <w:sz w:val="21"/>
               </w:rPr>
-              <w:t>WORKFLOW_7_guideline_sources.docx</w:t>
+              <w:t>Skills_7_guideline_sources.docx</w:t>
             </w:r>
           </w:p>
         </w:tc>
@@ -678,7 +678,7 @@
               <w:rPr>
                 <w:sz w:val="21"/>
               </w:rPr>
-              <w:t>WORKFLOW_8_report_template.docx</w:t>
+              <w:t>Skills_8_report_template.docx</w:t>
             </w:r>
           </w:p>
         </w:tc>
@@ -834,7 +834,7 @@
         <w:t xml:space="preserve">Show one reported finding, its original quotation, the guideline section actually read, and the report statement supported by that evidence. A file named </w:t>
       </w:r>
       <w:r>
-        <w:t>WORKFLOW_7_guideline_sources</w:t>
+        <w:t>Skills_7_guideline_sources</w:t>
       </w:r>
       <w:r>
         <w:t xml:space="preserve"> supplies the source address and scope; it is not itself the guideline. The default is the public 2022 WHO fifth-edition myeloid overview, rather than a claim to have consulted the full current Blue Book. If Claude cannot read the necessary article text, it should pause derived classification and request the original article as an upload.</w:t>
@@ -1282,21 +1282,21 @@
       <w:r>
         <w:t>Read and follow these eight uploaded modules as the user's workflow instructions. Prefer the complete Word (.docx) set; the complete Markdown (.md) set is an alternative. Use one version of each module plus the four PDFs: 12 uploads total.</w:t>
         <w:br/>
-        <w:t>1. WORKFLOW_1_procedure.docx or WORKFLOW_1_procedure.md — stages and evidence boundaries.</w:t>
+        <w:t>1. Skills_1_procedure.docx or Skills_1_procedure.md — stages and evidence boundaries.</w:t>
         <w:br/>
-        <w:t>2. WORKFLOW_2_extraction_rules_all_reports.docx or WORKFLOW_2_extraction_rules_all_reports.md — shared extraction policy.</w:t>
+        <w:t>2. Skills_2_extraction_rules_all_reports.docx or Skills_2_extraction_rules_all_reports.md — shared extraction policy.</w:t>
         <w:br/>
-        <w:t>3. WORKFLOW_3_checklist_morphology.docx or WORKFLOW_3_checklist_morphology.md — morphology checklist.</w:t>
+        <w:t>3. Skills_3_checklist_morphology.docx or Skills_3_checklist_morphology.md — morphology checklist.</w:t>
         <w:br/>
-        <w:t>4. WORKFLOW_4_checklist_flow_cytometry.docx or WORKFLOW_4_checklist_flow_cytometry.md — flow cytometry checklist.</w:t>
+        <w:t>4. Skills_4_checklist_flow_cytometry.docx or Skills_4_checklist_flow_cytometry.md — flow cytometry checklist.</w:t>
         <w:br/>
-        <w:t>5. WORKFLOW_5_checklist_cytogenetics_FISH.docx or WORKFLOW_5_checklist_cytogenetics_FISH.md — cytogenetics/FISH checklist.</w:t>
+        <w:t>5. Skills_5_checklist_cytogenetics_FISH.docx or Skills_5_checklist_cytogenetics_FISH.md — cytogenetics/FISH checklist.</w:t>
         <w:br/>
-        <w:t>6. WORKFLOW_6_checklist_molecular.docx or WORKFLOW_6_checklist_molecular.md — molecular checklist.</w:t>
+        <w:t>6. Skills_6_checklist_molecular.docx or Skills_6_checklist_molecular.md — molecular checklist.</w:t>
         <w:br/>
-        <w:t>7. WORKFLOW_7_guideline_sources.docx or WORKFLOW_7_guideline_sources.md — approved sources and scope.</w:t>
+        <w:t>7. Skills_7_guideline_sources.docx or Skills_7_guideline_sources.md — approved sources and scope.</w:t>
         <w:br/>
-        <w:t>8. WORKFLOW_8_report_template.docx or WORKFLOW_8_report_template.md — evidence, draft, and review format.</w:t>
+        <w:t>8. Skills_8_report_template.docx or Skills_8_report_template.md — evidence, draft, and review format.</w:t>
       </w:r>
     </w:p>
     <w:p>
@@ -1388,7 +1388,7 @@
         <w:spacing w:after="160" w:line="254" w:lineRule="auto"/>
       </w:pPr>
       <w:r>
-        <w:t>Follow the selected WORKFLOW_1_procedure document: inventory; four report-specific extraction passes; actual guideline access; criteria assessment; evidence-linked draft; same-conversation review. These stages share one conversation. Do not claim independent agents, isolated contexts, independent QA, or verification that did not occur.</w:t>
+        <w:t>Follow the selected Skills_1_procedure document: inventory; four report-specific extraction passes; actual guideline access; criteria assessment; evidence-linked draft; same-conversation review. These stages share one conversation. Do not claim independent agents, isolated contexts, independent QA, or verification that did not occur.</w:t>
       </w:r>
     </w:p>
     <w:p>
@@ -1469,21 +1469,21 @@
       <w:r>
         <w:t>Check one complete set of eight workflow documents. The Word set is preferred; the Markdown set is an alternative. Each pair below represents one module, not two required uploads:</w:t>
         <w:br/>
-        <w:t>WORKFLOW_1_procedure.docx or WORKFLOW_1_procedure.md</w:t>
+        <w:t>Skills_1_procedure.docx or Skills_1_procedure.md</w:t>
         <w:br/>
-        <w:t>WORKFLOW_2_extraction_rules_all_reports.docx or WORKFLOW_2_extraction_rules_all_reports.md</w:t>
+        <w:t>Skills_2_extraction_rules_all_reports.docx or Skills_2_extraction_rules_all_reports.md</w:t>
         <w:br/>
-        <w:t>WORKFLOW_3_checklist_morphology.docx or WORKFLOW_3_checklist_morphology.md</w:t>
+        <w:t>Skills_3_checklist_morphology.docx or Skills_3_checklist_morphology.md</w:t>
         <w:br/>
-        <w:t>WORKFLOW_4_checklist_flow_cytometry.docx or WORKFLOW_4_checklist_flow_cytometry.md</w:t>
+        <w:t>Skills_4_checklist_flow_cytometry.docx or Skills_4_checklist_flow_cytometry.md</w:t>
         <w:br/>
-        <w:t>WORKFLOW_5_checklist_cytogenetics_FISH.docx or WORKFLOW_5_checklist_cytogenetics_FISH.md</w:t>
+        <w:t>Skills_5_checklist_cytogenetics_FISH.docx or Skills_5_checklist_cytogenetics_FISH.md</w:t>
         <w:br/>
-        <w:t>WORKFLOW_6_checklist_molecular.docx or WORKFLOW_6_checklist_molecular.md</w:t>
+        <w:t>Skills_6_checklist_molecular.docx or Skills_6_checklist_molecular.md</w:t>
         <w:br/>
-        <w:t>WORKFLOW_7_guideline_sources.docx or WORKFLOW_7_guideline_sources.md</w:t>
+        <w:t>Skills_7_guideline_sources.docx or Skills_7_guideline_sources.md</w:t>
         <w:br/>
-        <w:t>WORKFLOW_8_report_template.docx or WORKFLOW_8_report_template.md</w:t>
+        <w:t>Skills_8_report_template.docx or Skills_8_report_template.md</w:t>
       </w:r>
     </w:p>
     <w:p>
@@ -1533,7 +1533,7 @@
         <w:spacing w:after="160" w:line="254" w:lineRule="auto"/>
       </w:pPr>
       <w:r>
-        <w:t>Resolve links inside the selected WORKFLOW_1_procedure document to individually uploaded files with the matching names and format. Report duplicate versions separately. If their instructions agree, select Word once and note the choice; if they differ or cannot be compared, request a selection before the affected stage. Do not merge conflicting versions. Request complete accessible copies of missing or incomplete documents; do not reconstruct unavailable content.</w:t>
+        <w:t>Resolve links inside the selected Skills_1_procedure document to individually uploaded files with the matching names and format. Report duplicate versions separately. If their instructions agree, select Word once and note the choice; if they differ or cannot be compared, request a selection before the affected stage. Do not merge conflicting versions. Request complete accessible copies of missing or incomplete documents; do not reconstruct unavailable content.</w:t>
       </w:r>
     </w:p>
     <w:p>
@@ -1562,7 +1562,7 @@
         <w:spacing w:after="160" w:line="254" w:lineRule="auto"/>
       </w:pPr>
       <w:r>
-        <w:t>Run the integrated-reporting demonstration using this Project's selected WORKFLOW_1_procedure.docx and seven supporting Word modules, or the equivalent complete .md set if that is what I uploaded. Use one version per module and only the four named component PDFs as case evidence. Confirm access and resolve any differing duplicate versions before their affected stages; do not merge conflicting instructions. Carry out the full workflow without asking me to run code or supply an API key.</w:t>
+        <w:t>Run the integrated-reporting demonstration using this Project's selected Skills_1_procedure.docx and seven supporting Word modules, or the equivalent complete .md set if that is what I uploaded. Use one version per module and only the four named component PDFs as case evidence. Confirm access and resolve any differing duplicate versions before their affected stages; do not merge conflicting instructions. Carry out the full workflow without asking me to run code or supply an API key.</w:t>
       </w:r>
     </w:p>
     <w:p>
@@ -1590,7 +1590,7 @@
         <w:spacing w:after="160" w:line="254" w:lineRule="auto"/>
       </w:pPr>
       <w:r>
-        <w:t>Read the approved WHO article online using WORKFLOW_7_guideline_sources.docx or WORKFLOW_7_guideline_sources.md from the selected set, including the applicable full sections, tables, footnotes, exceptions, and scope. Show its source card and the portions actually accessed. Do not replace source reading with a search snippet or model memory. If necessary instruction files, reports, or guidance cannot be read, identify the affected stage, retain useful completed work, and request the missing accessible material. Pause derived classification when required guidance is unavailable.</w:t>
+        <w:t>Read the approved WHO article online using Skills_7_guideline_sources.docx or Skills_7_guideline_sources.md from the selected set, including the applicable full sections, tables, footnotes, exceptions, and scope. Show its source card and the portions actually accessed. Do not replace source reading with a search snippet or model memory. If necessary instruction files, reports, or guidance cannot be read, identify the affected stage, retain useful completed work, and request the missing accessible material. Pause derived classification when required guidance is unavailable.</w:t>
       </w:r>
     </w:p>
     <w:p>

</xml_diff>

<commit_message>
Rename Skills_1_procedure to Skills_1_master_procedure
Co-Authored-By: Claude Opus 5.5 <noreply@anthropic.com>
Claude-Session: https://claude.ai/code/session_01PYw58WQVA2wzKi8sLfS5ru
</commit_message>
<xml_diff>
--- a/manual_demo/claude_project/PARTICIPANT_GUIDE.docx
+++ b/manual_demo/claude_project/PARTICIPANT_GUIDE.docx
@@ -321,7 +321,7 @@
               <w:rPr>
                 <w:sz w:val="21"/>
               </w:rPr>
-              <w:t>Skills_1_procedure.docx</w:t>
+              <w:t>Skills_1_master_procedure.docx</w:t>
             </w:r>
           </w:p>
         </w:tc>
@@ -1282,7 +1282,7 @@
       <w:r>
         <w:t>Read and follow these eight uploaded modules as the user's workflow instructions. Prefer the complete Word (.docx) set; the complete Markdown (.md) set is an alternative. Use one version of each module plus the four PDFs: 12 uploads total.</w:t>
         <w:br/>
-        <w:t>1. Skills_1_procedure.docx or Skills_1_procedure.md — stages and evidence boundaries.</w:t>
+        <w:t>1. Skills_1_master_procedure.docx or Skills_1_master_procedure.md — stages and evidence boundaries.</w:t>
         <w:br/>
         <w:t>2. Skills_2_extraction_rules_all_reports.docx or Skills_2_extraction_rules_all_reports.md — shared extraction policy.</w:t>
         <w:br/>
@@ -1388,7 +1388,7 @@
         <w:spacing w:after="160" w:line="254" w:lineRule="auto"/>
       </w:pPr>
       <w:r>
-        <w:t>Follow the selected Skills_1_procedure document: inventory; four report-specific extraction passes; actual guideline access; criteria assessment; evidence-linked draft; same-conversation review. These stages share one conversation. Do not claim independent agents, isolated contexts, independent QA, or verification that did not occur.</w:t>
+        <w:t>Follow the selected Skills_1_master_procedure document: inventory; four report-specific extraction passes; actual guideline access; criteria assessment; evidence-linked draft; same-conversation review. These stages share one conversation. Do not claim independent agents, isolated contexts, independent QA, or verification that did not occur.</w:t>
       </w:r>
     </w:p>
     <w:p>
@@ -1469,7 +1469,7 @@
       <w:r>
         <w:t>Check one complete set of eight workflow documents. The Word set is preferred; the Markdown set is an alternative. Each pair below represents one module, not two required uploads:</w:t>
         <w:br/>
-        <w:t>Skills_1_procedure.docx or Skills_1_procedure.md</w:t>
+        <w:t>Skills_1_master_procedure.docx or Skills_1_master_procedure.md</w:t>
         <w:br/>
         <w:t>Skills_2_extraction_rules_all_reports.docx or Skills_2_extraction_rules_all_reports.md</w:t>
         <w:br/>
@@ -1533,7 +1533,7 @@
         <w:spacing w:after="160" w:line="254" w:lineRule="auto"/>
       </w:pPr>
       <w:r>
-        <w:t>Resolve links inside the selected Skills_1_procedure document to individually uploaded files with the matching names and format. Report duplicate versions separately. If their instructions agree, select Word once and note the choice; if they differ or cannot be compared, request a selection before the affected stage. Do not merge conflicting versions. Request complete accessible copies of missing or incomplete documents; do not reconstruct unavailable content.</w:t>
+        <w:t>Resolve links inside the selected Skills_1_master_procedure document to individually uploaded files with the matching names and format. Report duplicate versions separately. If their instructions agree, select Word once and note the choice; if they differ or cannot be compared, request a selection before the affected stage. Do not merge conflicting versions. Request complete accessible copies of missing or incomplete documents; do not reconstruct unavailable content.</w:t>
       </w:r>
     </w:p>
     <w:p>
@@ -1562,7 +1562,7 @@
         <w:spacing w:after="160" w:line="254" w:lineRule="auto"/>
       </w:pPr>
       <w:r>
-        <w:t>Run the integrated-reporting demonstration using this Project's selected Skills_1_procedure.docx and seven supporting Word modules, or the equivalent complete .md set if that is what I uploaded. Use one version per module and only the four named component PDFs as case evidence. Confirm access and resolve any differing duplicate versions before their affected stages; do not merge conflicting instructions. Carry out the full workflow without asking me to run code or supply an API key.</w:t>
+        <w:t>Run the integrated-reporting demonstration using this Project's selected Skills_1_master_procedure.docx and seven supporting Word modules, or the equivalent complete .md set if that is what I uploaded. Use one version per module and only the four named component PDFs as case evidence. Confirm access and resolve any differing duplicate versions before their affected stages; do not merge conflicting instructions. Carry out the full workflow without asking me to run code or supply an API key.</w:t>
       </w:r>
     </w:p>
     <w:p>

</xml_diff>

<commit_message>
Rename report checklists to report-specific extraction rules
Skills_3..6 are now Skills_N_extraction_rules_<report>. Update file references and descriptions in instructions, master procedure, participant guide, READMEs and the rebuilt kit zip.

Co-Authored-By: Claude Opus 5.5 <noreply@anthropic.com>
Claude-Session: https://claude.ai/code/session_01PYw58WQVA2wzKi8sLfS5ru
</commit_message>
<xml_diff>
--- a/manual_demo/claude_project/PARTICIPANT_GUIDE.docx
+++ b/manual_demo/claude_project/PARTICIPANT_GUIDE.docx
@@ -423,7 +423,7 @@
               <w:rPr>
                 <w:sz w:val="21"/>
               </w:rPr>
-              <w:t>Skills_3_checklist_morphology.docx</w:t>
+              <w:t>Skills_3_extraction_rules_morphology.docx</w:t>
             </w:r>
           </w:p>
         </w:tc>
@@ -474,7 +474,7 @@
               <w:rPr>
                 <w:sz w:val="21"/>
               </w:rPr>
-              <w:t>Skills_4_checklist_flow_cytometry.docx</w:t>
+              <w:t>Skills_4_extraction_rules_flow_cytometry.docx</w:t>
             </w:r>
           </w:p>
         </w:tc>
@@ -525,7 +525,7 @@
               <w:rPr>
                 <w:sz w:val="21"/>
               </w:rPr>
-              <w:t>Skills_5_checklist_cytogenetics_FISH.docx</w:t>
+              <w:t>Skills_5_extraction_rules_cytogenetics_FISH.docx</w:t>
             </w:r>
           </w:p>
         </w:tc>
@@ -576,7 +576,7 @@
               <w:rPr>
                 <w:sz w:val="21"/>
               </w:rPr>
-              <w:t>Skills_6_checklist_molecular.docx</w:t>
+              <w:t>Skills_6_extraction_rules_molecular.docx</w:t>
             </w:r>
           </w:p>
         </w:tc>
@@ -1286,13 +1286,13 @@
         <w:br/>
         <w:t>2. Skills_2_extraction_rules_all_reports.docx or Skills_2_extraction_rules_all_reports.md — shared extraction policy.</w:t>
         <w:br/>
-        <w:t>3. Skills_3_checklist_morphology.docx or Skills_3_checklist_morphology.md — morphology checklist.</w:t>
+        <w:t>3. Skills_3_extraction_rules_morphology.docx or Skills_3_extraction_rules_morphology.md — morphology extraction rules.</w:t>
         <w:br/>
-        <w:t>4. Skills_4_checklist_flow_cytometry.docx or Skills_4_checklist_flow_cytometry.md — flow cytometry checklist.</w:t>
+        <w:t>4. Skills_4_extraction_rules_flow_cytometry.docx or Skills_4_extraction_rules_flow_cytometry.md — flow cytometry extraction rules.</w:t>
         <w:br/>
-        <w:t>5. Skills_5_checklist_cytogenetics_FISH.docx or Skills_5_checklist_cytogenetics_FISH.md — cytogenetics/FISH checklist.</w:t>
+        <w:t>5. Skills_5_extraction_rules_cytogenetics_FISH.docx or Skills_5_extraction_rules_cytogenetics_FISH.md — cytogenetics/FISH extraction rules.</w:t>
         <w:br/>
-        <w:t>6. Skills_6_checklist_molecular.docx or Skills_6_checklist_molecular.md — molecular checklist.</w:t>
+        <w:t>6. Skills_6_extraction_rules_molecular.docx or Skills_6_extraction_rules_molecular.md — molecular extraction rules.</w:t>
         <w:br/>
         <w:t>7. Skills_7_guideline_sources.docx or Skills_7_guideline_sources.md — approved sources and scope.</w:t>
         <w:br/>
@@ -1473,13 +1473,13 @@
         <w:br/>
         <w:t>Skills_2_extraction_rules_all_reports.docx or Skills_2_extraction_rules_all_reports.md</w:t>
         <w:br/>
-        <w:t>Skills_3_checklist_morphology.docx or Skills_3_checklist_morphology.md</w:t>
+        <w:t>Skills_3_extraction_rules_morphology.docx or Skills_3_extraction_rules_morphology.md</w:t>
         <w:br/>
-        <w:t>Skills_4_checklist_flow_cytometry.docx or Skills_4_checklist_flow_cytometry.md</w:t>
+        <w:t>Skills_4_extraction_rules_flow_cytometry.docx or Skills_4_extraction_rules_flow_cytometry.md</w:t>
         <w:br/>
-        <w:t>Skills_5_checklist_cytogenetics_FISH.docx or Skills_5_checklist_cytogenetics_FISH.md</w:t>
+        <w:t>Skills_5_extraction_rules_cytogenetics_FISH.docx or Skills_5_extraction_rules_cytogenetics_FISH.md</w:t>
         <w:br/>
-        <w:t>Skills_6_checklist_molecular.docx or Skills_6_checklist_molecular.md</w:t>
+        <w:t>Skills_6_extraction_rules_molecular.docx or Skills_6_extraction_rules_molecular.md</w:t>
         <w:br/>
         <w:t>Skills_7_guideline_sources.docx or Skills_7_guideline_sources.md</w:t>
         <w:br/>

</xml_diff>

<commit_message>
Rename Skills_8_report_template to Skills_8_integrated_report_template
Co-Authored-By: Claude Opus 5.5 <noreply@anthropic.com>
Claude-Session: https://claude.ai/code/session_01PYw58WQVA2wzKi8sLfS5ru
</commit_message>
<xml_diff>
--- a/manual_demo/claude_project/PARTICIPANT_GUIDE.docx
+++ b/manual_demo/claude_project/PARTICIPANT_GUIDE.docx
@@ -678,7 +678,7 @@
               <w:rPr>
                 <w:sz w:val="21"/>
               </w:rPr>
-              <w:t>Skills_8_report_template.docx</w:t>
+              <w:t>Skills_8_integrated_report_template.docx</w:t>
             </w:r>
           </w:p>
         </w:tc>
@@ -1296,7 +1296,7 @@
         <w:br/>
         <w:t>7. Skills_7_guideline_sources.docx or Skills_7_guideline_sources.md — approved sources and scope.</w:t>
         <w:br/>
-        <w:t>8. Skills_8_report_template.docx or Skills_8_report_template.md — evidence, draft, and review format.</w:t>
+        <w:t>8. Skills_8_integrated_report_template.docx or Skills_8_integrated_report_template.md — evidence, draft, and review format.</w:t>
       </w:r>
     </w:p>
     <w:p>
@@ -1483,7 +1483,7 @@
         <w:br/>
         <w:t>Skills_7_guideline_sources.docx or Skills_7_guideline_sources.md</w:t>
         <w:br/>
-        <w:t>Skills_8_report_template.docx or Skills_8_report_template.md</w:t>
+        <w:t>Skills_8_integrated_report_template.docx or Skills_8_integrated_report_template.md</w:t>
       </w:r>
     </w:p>
     <w:p>

</xml_diff>

<commit_message>
Rename CASE_0N report PDFs to Pathology_Report_N
Co-Authored-By: Claude Opus 5.5 <noreply@anthropic.com>
Claude-Session: https://claude.ai/code/session_01PYw58WQVA2wzKi8sLfS5ru
</commit_message>
<xml_diff>
--- a/manual_demo/claude_project/PARTICIPANT_GUIDE.docx
+++ b/manual_demo/claude_project/PARTICIPANT_GUIDE.docx
@@ -725,7 +725,7 @@
         <w:pStyle w:val="ListBullet"/>
       </w:pPr>
       <w:r>
-        <w:t>CASE_01_bone_marrow_morphology.pdf</w:t>
+        <w:t>Pathology_Report_1_bone_marrow_morphology.pdf</w:t>
       </w:r>
     </w:p>
     <w:p>
@@ -733,7 +733,7 @@
         <w:pStyle w:val="ListBullet"/>
       </w:pPr>
       <w:r>
-        <w:t>CASE_02_flow_cytometry.pdf</w:t>
+        <w:t>Pathology_Report_2_flow_cytometry.pdf</w:t>
       </w:r>
     </w:p>
     <w:p>
@@ -741,7 +741,7 @@
         <w:pStyle w:val="ListBullet"/>
       </w:pPr>
       <w:r>
-        <w:t>CASE_03_cytogenetics_fish.pdf</w:t>
+        <w:t>Pathology_Report_3_cytogenetics_fish.pdf</w:t>
       </w:r>
     </w:p>
     <w:p>
@@ -749,7 +749,7 @@
         <w:pStyle w:val="ListBullet"/>
       </w:pPr>
       <w:r>
-        <w:t>CASE_04_molecular_ngs.pdf</w:t>
+        <w:t>Pathology_Report_4_molecular_ngs.pdf</w:t>
       </w:r>
     </w:p>
     <w:p>
@@ -1354,13 +1354,13 @@
       <w:r>
         <w:t>Use only these four uploaded PDFs as patient/case evidence:</w:t>
         <w:br/>
-        <w:t>- CASE_01_bone_marrow_morphology.pdf → MORPH</w:t>
+        <w:t>- Pathology_Report_1_bone_marrow_morphology.pdf → MORPH</w:t>
         <w:br/>
-        <w:t>- CASE_02_flow_cytometry.pdf → FLOW</w:t>
+        <w:t>- Pathology_Report_2_flow_cytometry.pdf → FLOW</w:t>
         <w:br/>
-        <w:t>- CASE_03_cytogenetics_fish.pdf → CYTO</w:t>
+        <w:t>- Pathology_Report_3_cytogenetics_fish.pdf → CYTO</w:t>
         <w:br/>
-        <w:t>- CASE_04_molecular_ngs.pdf → MOLEC</w:t>
+        <w:t>- Pathology_Report_4_molecular_ngs.pdf → MOLEC</w:t>
       </w:r>
     </w:p>
     <w:p>
@@ -1493,13 +1493,13 @@
       <w:r>
         <w:t>Check these four case reports:</w:t>
         <w:br/>
-        <w:t>CASE_01_bone_marrow_morphology.pdf</w:t>
+        <w:t>Pathology_Report_1_bone_marrow_morphology.pdf</w:t>
         <w:br/>
-        <w:t>CASE_02_flow_cytometry.pdf</w:t>
+        <w:t>Pathology_Report_2_flow_cytometry.pdf</w:t>
         <w:br/>
-        <w:t>CASE_03_cytogenetics_fish.pdf</w:t>
+        <w:t>Pathology_Report_3_cytogenetics_fish.pdf</w:t>
         <w:br/>
-        <w:t>CASE_04_molecular_ngs.pdf</w:t>
+        <w:t>Pathology_Report_4_molecular_ngs.pdf</w:t>
       </w:r>
     </w:p>
     <w:p>

</xml_diff>

<commit_message>
Align all routes and documentation with Skills_/Pathology_Report_ names
- Use 'Skills files' and 'pathology reports' consistently in the READMEs, START_HERE, docs, Project instructions, prompts and Word participant guide.
- Rename the native Skill package's reference files to the Skills_2..8 names (SKILL.md keeps the name Claude Skills require) and update its links.
- Rebuild integrated-reporting-demo.zip, Claude_Project_Demo_Kit.zip and AC3_No_Code_Demo_Kit.zip from the current files; the multi-route kit's reports are now Pathology_Report_1..4.

Co-Authored-By: Claude Opus 5.5 <noreply@anthropic.com>
Claude-Session: https://claude.ai/code/session_01PYw58WQVA2wzKi8sLfS5ru
</commit_message>
<xml_diff>
--- a/manual_demo/claude_project/PARTICIPANT_GUIDE.docx
+++ b/manual_demo/claude_project/PARTICIPANT_GUIDE.docx
@@ -21,7 +21,7 @@
         <w:t>Word files</w:t>
       </w:r>
       <w:r>
-        <w:t>; an equivalent Markdown set is included for those who prefer plain text. The four case reports remain PDFs. No programming or native Skill installation is required.</w:t>
+        <w:t>; an equivalent Markdown set is included for those who prefer plain text. The four pathology reports remain PDFs. No programming or native Skill installation is required.</w:t>
       </w:r>
     </w:p>
     <w:p>
@@ -57,7 +57,7 @@
         <w:t>upload_word/</w:t>
       </w:r>
       <w:r>
-        <w:t xml:space="preserve">. It contains eight Word workflow files and four PDF reports, twelve files in total. The alternative </w:t>
+        <w:t xml:space="preserve">. It contains eight Skills files (Word) and four pathology reports (PDF), twelve files in total. The alternative </w:t>
       </w:r>
       <w:r>
         <w:rPr>
@@ -66,7 +66,7 @@
         <w:t>upload_files/</w:t>
       </w:r>
       <w:r>
-        <w:t xml:space="preserve"> folder contains the same eight workflow modules as Markdown plus the same four PDFs. Choose one complete set. Uploading both sets creates duplicate instructions.</w:t>
+        <w:t xml:space="preserve"> folder contains the same eight Skills files as Markdown plus the same four PDFs. Choose one complete set. Uploading both sets creates duplicate instructions.</w:t>
       </w:r>
     </w:p>
     <w:p>
@@ -220,7 +220,7 @@
         <w:pStyle w:val="Heading2"/>
       </w:pPr>
       <w:r>
-        <w:t>Eight workflow documents</w:t>
+        <w:t>Eight Skills files</w:t>
       </w:r>
     </w:p>
     <w:tbl>
@@ -717,7 +717,7 @@
         <w:pStyle w:val="Heading2"/>
       </w:pPr>
       <w:r>
-        <w:t>Four source reports</w:t>
+        <w:t>Four pathology reports</w:t>
       </w:r>
     </w:p>
     <w:p>
@@ -754,7 +754,7 @@
     </w:p>
     <w:p>
       <w:r>
-        <w:t xml:space="preserve">The Markdown alternative uses the same workflow filenames ending in </w:t>
+        <w:t xml:space="preserve">The Markdown alternative uses the same Skills filenames ending in </w:t>
       </w:r>
       <w:r>
         <w:t>.md</w:t>
@@ -1020,7 +1020,7 @@
               <w:rPr>
                 <w:sz w:val="21"/>
               </w:rPr>
-              <w:t>Project instructions and the eight uploaded Word workflow documents</w:t>
+              <w:t>Project instructions and the eight uploaded Skills files</w:t>
             </w:r>
           </w:p>
         </w:tc>
@@ -1222,7 +1222,7 @@
         <w:t>Use skills in Claude (https://support.claude.com/en/articles/12512180-use-skills-in-claude)</w:t>
       </w:r>
       <w:r>
-        <w:t>. Uploading a Word or Markdown workflow document to Project knowledge does not itself install a native Skill.</w:t>
+        <w:t>. Uploading a Word or Markdown Skills file to Project knowledge does not itself install a native Skill.</w:t>
       </w:r>
     </w:p>
     <w:p>
@@ -1272,7 +1272,7 @@
         <w:rPr>
           <w:b/>
         </w:rPr>
-        <w:t>AUTHORIZED WORKFLOW DOCUMENTS</w:t>
+        <w:t>AUTHORIZED SKILLS FILES</w:t>
       </w:r>
     </w:p>
     <w:p>
@@ -1304,7 +1304,7 @@
         <w:spacing w:after="160" w:line="254" w:lineRule="auto"/>
       </w:pPr>
       <w:r>
-        <w:t>Files have flat filenames. Resolve internal references to the corresponding uploaded filename in the selected format. These are Project workflow documents; do not claim native Skill installation.</w:t>
+        <w:t>Files have flat filenames. Resolve internal references to the corresponding uploaded filename in the selected format. The Skills_ files are workflow documents uploaded to this Project, not installed native Skills; do not claim native Skill installation.</w:t>
       </w:r>
     </w:p>
     <w:p>
@@ -1467,7 +1467,7 @@
         <w:spacing w:after="160" w:line="254" w:lineRule="auto"/>
       </w:pPr>
       <w:r>
-        <w:t>Check one complete set of eight workflow documents. The Word set is preferred; the Markdown set is an alternative. Each pair below represents one module, not two required uploads:</w:t>
+        <w:t>Check one complete set of eight Skills files. The Word set is preferred; the Markdown set is an alternative. Each pair below represents one module, not two required uploads:</w:t>
         <w:br/>
         <w:t>Skills_1_master_procedure.docx or Skills_1_master_procedure.md</w:t>
         <w:br/>
@@ -1491,7 +1491,7 @@
         <w:spacing w:after="160" w:line="254" w:lineRule="auto"/>
       </w:pPr>
       <w:r>
-        <w:t>Check these four case reports:</w:t>
+        <w:t>Check these four pathology reports:</w:t>
         <w:br/>
         <w:t>Pathology_Report_1_bone_marrow_morphology.pdf</w:t>
         <w:br/>
@@ -1507,7 +1507,7 @@
         <w:spacing w:after="160" w:line="254" w:lineRule="auto"/>
       </w:pPr>
       <w:r>
-        <w:t>The intended upload set is eight workflow documents plus four PDFs: 12 files. Return one compact table naming the actual selected files:</w:t>
+        <w:t>The intended upload set is eight Skills files plus four PDFs: 12 files. Return one compact table naming the actual selected files:</w:t>
         <w:br/>
         <w:t>Filename | Access status | Scope actually read | Short evidence of access</w:t>
       </w:r>
@@ -1525,7 +1525,7 @@
         <w:spacing w:after="160" w:line="254" w:lineRule="auto"/>
       </w:pPr>
       <w:r>
-        <w:t>For each Word or Markdown workflow document, give an actual heading and a short instruction actually present in its content. Word pagination can differ from other formats; cite its actual heading/location. For each PDF, give one report identifier, such as its accession, and its actual page or identifiable location. Avoid diagnostic findings. A single example establishes access to that location, not proof that unread portions were reviewed; report the read scope honestly.</w:t>
+        <w:t>For each Word or Markdown Skills file, give an actual heading and a short instruction actually present in its content. Word pagination can differ from other formats; cite its actual heading/location. For each PDF, give one report identifier, such as its accession, and its actual page or identifiable location. Avoid diagnostic findings. A single example establishes access to that location, not proof that unread portions were reviewed; report the read scope honestly.</w:t>
       </w:r>
     </w:p>
     <w:p>

</xml_diff>

<commit_message>
Add WHO and ELN guideline PDFs, attach-WHO step, and test runs
- manual_demo/claude_project/guidelines/: Khoury et al. 2022 WHO 5th edition (CC BY 4.0) and Dohner et al. 2022 ELN (CC BY-NC-ND 4.0, unmodified), with a README giving citations, licences and when to use each.
- Step 5 now attaches the WHO PDF in the Project chat so runs do not depend on web access; run prompt, kit README, Word guide and main README updated.
- runs/claude_project_test/: regular chat x2, setup check, and Project runs without and with the WHO article, compared with the answer key.
- Rebuild Claude_Project_Demo_Kit.zip and AC3_No_Code_Demo_Kit.zip.

Co-Authored-By: Claude Opus 5.5 <noreply@anthropic.com>
Claude-Session: https://claude.ai/code/session_01PYw58WQVA2wzKi8sLfS5ru
</commit_message>
<xml_diff>
--- a/manual_demo/claude_project/PARTICIPANT_GUIDE.docx
+++ b/manual_demo/claude_project/PARTICIPANT_GUIDE.docx
@@ -797,6 +797,11 @@
     </w:p>
     <w:p>
       <w:r>
+        <w:t>Attach guidelines/WHO_2022_Khoury_myeloid_5th_edition.pdf to this chat before you send the prompt (paperclip or + → upload). Claude then reads the original WHO article from the attachment and labels it an uploaded source, so the run does not depend on web access. Do not attach the ELN article unless you want a formal risk category, and never attach the answer key.</w:t>
+      </w:r>
+    </w:p>
+    <w:p>
+      <w:r>
         <w:t xml:space="preserve">In that Project conversation, send </w:t>
       </w:r>
       <w:r>
@@ -1590,7 +1595,7 @@
         <w:spacing w:after="160" w:line="254" w:lineRule="auto"/>
       </w:pPr>
       <w:r>
-        <w:t>Read the approved WHO article online using Skills_7_guideline_sources.docx or Skills_7_guideline_sources.md from the selected set, including the applicable full sections, tables, footnotes, exceptions, and scope. Show its source card and the portions actually accessed. Do not replace source reading with a search snippet or model memory. If necessary instruction files, reports, or guidance cannot be read, identify the affected stage, retain useful completed work, and request the missing accessible material. Pause derived classification when required guidance is unavailable.</w:t>
+        <w:t>Read the approved WHO article using Skills_7_guideline_sources.docx or Skills_7_guideline_sources.md from the selected set. If I attached the original WHO article PDF to this chat, use it and label it an uploaded source; otherwise open it online. Read it including the applicable full sections, tables, footnotes, exceptions, and scope. Show its source card and the portions actually accessed. Do not replace source reading with a search snippet or model memory. If necessary instruction files, reports, or guidance cannot be read, identify the affected stage, retain useful completed work, and request the missing accessible material. Pause derived classification when required guidance is unavailable.</w:t>
       </w:r>
     </w:p>
     <w:p>

</xml_diff>

<commit_message>
Split Claude Project kit into SKILLS, PATHOLOGY_REPORTS, SKILLS_MARKDOWN and GUIDELINES folders
Replaces the upload_word/ and upload_files/ sets with folders named by
function; filenames are unchanged. Updates README, kit README, START_HERE,
docs, run notes, the Word participant guide and both kit zips.

Co-Authored-By: Claude Opus 5.5 <noreply@anthropic.com>
Claude-Session: https://claude.ai/code/session_01PYw58WQVA2wzKi8sLfS5ru
</commit_message>
<xml_diff>
--- a/manual_demo/claude_project/PARTICIPANT_GUIDE.docx
+++ b/manual_demo/claude_project/PARTICIPANT_GUIDE.docx
@@ -48,25 +48,25 @@
     </w:p>
     <w:p>
       <w:r>
-        <w:t xml:space="preserve">For the workshop, use </w:t>
+        <w:t xml:space="preserve">Upload twelve files to the Project: the eight Skills files (Word) in </w:t>
       </w:r>
       <w:r>
         <w:rPr>
           <w:b/>
         </w:rPr>
-        <w:t>upload_word/</w:t>
+        <w:t>SKILLS/</w:t>
       </w:r>
       <w:r>
-        <w:t xml:space="preserve">. It contains eight Skills files (Word) and four pathology reports (PDF), twelve files in total. The alternative </w:t>
+        <w:t xml:space="preserve"> and the four pathology reports (PDF) in </w:t>
       </w:r>
       <w:r>
         <w:rPr>
           <w:b/>
         </w:rPr>
-        <w:t>upload_files/</w:t>
+        <w:t>PATHOLOGY_REPORTS/</w:t>
       </w:r>
       <w:r>
-        <w:t xml:space="preserve"> folder contains the same eight Skills files as Markdown plus the same four PDFs. Choose one complete set. Uploading both sets creates duplicate instructions.</w:t>
+        <w:t>. SKILLS_MARKDOWN/ holds the same eight Skills files as Markdown; use it instead of SKILLS/ if you prefer, never both, because uploading both creates duplicate instructions. GUIDELINES/ holds the original WHO and ELN articles; you attach the WHO article in step 5, you don't upload it to the Project.</w:t>
       </w:r>
     </w:p>
     <w:p>
@@ -206,10 +206,10 @@
         <w:t>+</w:t>
       </w:r>
       <w:r>
-        <w:t xml:space="preserve"> to upload each of the twelve documents from </w:t>
+        <w:t xml:space="preserve"> to upload each of the twelve documents: the eight in </w:t>
       </w:r>
       <w:r>
-        <w:t>upload_word/</w:t>
+        <w:t>SKILLS/ and the four in PATHOLOGY_REPORTS/</w:t>
       </w:r>
       <w:r>
         <w:t>. You may select them together while keeping them as individual files. Some accounts have a newer Project layout; use its corresponding files and instructions controls.</w:t>
@@ -797,7 +797,7 @@
     </w:p>
     <w:p>
       <w:r>
-        <w:t>Attach guidelines/WHO_2022_Khoury_myeloid_5th_edition.pdf to this chat before you send the prompt (paperclip or + → upload). Claude then reads the original WHO article from the attachment and labels it an uploaded source, so the run does not depend on web access. Do not attach the ELN article unless you want a formal risk category, and never attach the answer key.</w:t>
+        <w:t>Attach GUIDELINES/WHO_2022_Khoury_myeloid_5th_edition.pdf to this chat before you send the prompt (paperclip or + → upload). Claude then reads the original WHO article from the attachment and labels it an uploaded source, so the run does not depend on web access. Do not attach the ELN article unless you want a formal risk category, and never attach the answer key.</w:t>
       </w:r>
     </w:p>
     <w:p>

</xml_diff>